<commit_message>
feat: animated landscape scenes, hero video and tour previews
Rebuild Scene as layered animated artwork, render five looping MP4 clips
and posters, add hero video, tap-to-play video cards and a media config.

Co-Authored-By: Claude Sonnet 5.5 <noreply@anthropic.com>
Claude-Session: https://claude.ai/code/session_013DtDBtLrDH5MyVK24hDNW2
</commit_message>
<xml_diff>
--- a/docs/WHAT_I_DID.docx
+++ b/docs/WHAT_I_DID.docx
@@ -223,7 +223,7 @@
         <w:pStyle w:val="ListBullet"/>
       </w:pPr>
       <w:r>
-        <w:t>16 automated tests pass: all five routes and the 404 page, popup show and cookie dismissal, enquiry validation and successful submit, E-Club signup, gallery lightbox, and the validation rules on their own.</w:t>
+        <w:t>17 automated tests pass: all five routes and the 404 page, popup show and cookie dismissal, enquiry validation and successful submit, E-Club signup, gallery lightbox, and the validation rules on their own.</w:t>
       </w:r>
     </w:p>
     <w:p>
@@ -260,6 +260,51 @@
         <w:pStyle w:val="Heading1"/>
       </w:pPr>
       <w:r>
+        <w:t>6a. Images and video</w:t>
+      </w:r>
+    </w:p>
+    <w:p>
+      <w:r>
+        <w:t>The first version used flat placeholder artwork, which did not look convincing. I did not have access to licensed photography, so I rebuilt the visuals as layered landscape scenes: mountains, pine line, mown fairway, a pond with a reflection, drifting clouds, a swaying flag, birds and a slow camera push. I then rendered those animated scenes into five looping 12-second MP4 clips with ffmpeg.</w:t>
+      </w:r>
+    </w:p>
+    <w:p>
+      <w:pPr>
+        <w:pStyle w:val="ListBullet"/>
+      </w:pPr>
+      <w:r>
+        <w:t>The home page hero plays a muted looping background video, and each other page has its own clip.</w:t>
+      </w:r>
+    </w:p>
+    <w:p>
+      <w:pPr>
+        <w:pStyle w:val="ListBullet"/>
+      </w:pPr>
+      <w:r>
+        <w:t>A "Take a tour" section has four tap-to-play preview cards that open a video player.</w:t>
+      </w:r>
+    </w:p>
+    <w:p>
+      <w:pPr>
+        <w:pStyle w:val="ListBullet"/>
+      </w:pPr>
+      <w:r>
+        <w:t>Course pages have their own flyover previews.</w:t>
+      </w:r>
+    </w:p>
+    <w:p>
+      <w:pPr>
+        <w:pStyle w:val="ListBullet"/>
+      </w:pPr>
+      <w:r>
+        <w:t>All of it is controlled from one file (src/data/media.ts), so real photos and footage can replace the generated ones without touching the pages.</w:t>
+      </w:r>
+    </w:p>
+    <w:p>
+      <w:pPr>
+        <w:pStyle w:val="Heading1"/>
+      </w:pPr>
+      <w:r>
         <w:t>7. What is still placeholder or left to do</w:t>
       </w:r>
     </w:p>
@@ -268,7 +313,7 @@
         <w:pStyle w:val="ListBullet"/>
       </w:pPr>
       <w:r>
-        <w:t>Images are generated illustrations. Real course and event photography needs to replace them.</w:t>
+        <w:t>Images and video are generated illustrations. Real course and event photography and footage need to replace them (drop files into public/media).</w:t>
       </w:r>
     </w:p>
     <w:p>

</xml_diff>

<commit_message>
docs: simplify summary document
Co-Authored-By: Claude Sonnet 5.5 <noreply@anthropic.com>
Claude-Session: https://claude.ai/code/session_013DtDBtLrDH5MyVK24hDNW2
</commit_message>
<xml_diff>
--- a/docs/WHAT_I_DID.docx
+++ b/docs/WHAT_I_DID.docx
@@ -7,366 +7,73 @@
         <w:pStyle w:val="Title"/>
       </w:pPr>
       <w:r>
-        <w:t>Genoa Golf Club Website: What I Built (Front End)</w:t>
+        <w:t>Genoa Golf Club Website: Front End</w:t>
       </w:r>
     </w:p>
     <w:p>
       <w:r>
-        <w:t>Prepared by Sai Lohith Panthangi, Seer Solutions. Repository: genoa-golf-web.</w:t>
+        <w:t>I built the front end of the Genoa Golf Club website using React, Vite and TypeScript. The site has five pages: Home, Lakes Course, Ranch Course, Golf Outings and Membership. I worked from the page list and the Scope of Work, which describes what the homepage needs: a hero with a tee-time button and an events button, feature tiles, an events preview, a social feed, an E-Club signup, a Stay &amp; Play section, a popup that appears once every 14 days, and a venue enquiry form. Everything is built mobile-first, so it works on phones as well as desktops.</w:t>
+      </w:r>
+    </w:p>
+    <w:p>
+      <w:r>
+        <w:t>I started with the shared parts: the header with a collapsing mobile menu, the footer, and the layout every page sits in. Then I built the Home page with all the sections above. For the two course pages I made one reusable template and filled it with each course's details, such as holes, par, yardage, highlights, a hole-by-hole table and rates, so the two pages stay consistent. The Golf Outings page has the outing packages, a short how-it-works section and the enquiry form already set to the golf outing type. The Membership page has three membership tiers, a short FAQ and the E-Club signup.</w:t>
+      </w:r>
+    </w:p>
+    <w:p>
+      <w:r>
+        <w:t>The popup asks my backend which promotion is currently active and shows it on the home page. When someone closes it, the site remembers that for the number of days the server specifies, which is 14 by default. If the request fails, the page simply loads without the popup. The enquiry form checks the same rules as my backend (required fields, phone format, one to three future dates, and a guest count between 1 and 500), so people see mistakes straight away. If the server still rejects something, its message appears next to the right field, and after a successful submission the visitor sees their reference number. The E-Club signup and the upcoming events preview also connect to the backend. If no backend address is set, the site uses sample data so I can still work on the design on its own.</w:t>
+      </w:r>
+    </w:p>
+    <w:p>
+      <w:r>
+        <w:t>To make the site feel real, I added a looping video in the hero of each page, a tour section with four preview cards that open a video player, flyover previews on the course pages, and a photo gallery with a full-screen viewer. Since I did not have real photography yet, I created animated landscape scenes and rendered them into short looping clips. All the images and videos are controlled from one file, so real photos and footage can replace them later without changing the pages. I also added keyboard support, labelled form fields and a reduced-motion option for accessibility, and the less-used pages load only when needed so the first load stays fast.</w:t>
+      </w:r>
+    </w:p>
+    <w:p>
+      <w:r>
+        <w:t>I tested it with 17 automated tests that cover every page, the popup and its cookie, the enquiry form with both errors and a successful submission, the E-Club signup, the gallery viewer and the video player. The type-check and production build both pass, and I checked the layout in a browser at desktop and phone sizes.</w:t>
+      </w:r>
+    </w:p>
+    <w:p>
+      <w:r>
+        <w:t>To run it, install Node 20 or newer, open the project folder in VS Code, and run these in the terminal:</w:t>
       </w:r>
     </w:p>
     <w:p>
       <w:pPr>
-        <w:pStyle w:val="Heading1"/>
+        <w:spacing w:after="40"/>
+        <w:ind w:left="576"/>
       </w:pPr>
       <w:r>
-        <w:t>1. What I was asked to do</w:t>
-      </w:r>
-    </w:p>
-    <w:p>
-      <w:r>
-        <w:t>I was asked to build the front end of the Genoa Golf Club website with five pages: Home, Lakes Course, Ranch Course, Golf Outings and Membership. The back end (Spring Boot, PostgreSQL) was already done as part of the earlier tickets, so this work is focused only on what the visitor sees and uses in the browser.</w:t>
+        <w:rPr>
+          <w:rFonts w:ascii="Consolas" w:hAnsi="Consolas"/>
+          <w:sz w:val="21"/>
+        </w:rPr>
+        <w:t>npm install</w:t>
       </w:r>
     </w:p>
     <w:p>
       <w:pPr>
-        <w:pStyle w:val="Heading1"/>
+        <w:spacing w:after="40"/>
+        <w:ind w:left="576"/>
       </w:pPr>
       <w:r>
-        <w:t>2. How I approached it</w:t>
-      </w:r>
-    </w:p>
-    <w:p>
-      <w:r>
-        <w:t>I chose React with Vite and TypeScript. React lets me build the header, footer, forms and popup once and reuse them on every page. Vite gives a fast dev server and a small production build. TypeScript catches mistakes before the site runs, which matters because the forms must match the API exactly.</w:t>
-      </w:r>
-    </w:p>
-    <w:p>
-      <w:r>
-        <w:t>I started from the Scope of Work, which lists what the homepage must contain: a hero with two calls to action, feature tiles, an events preview, a social feed, an E-Club signup and a Stay &amp; Play highlight. It also requires a mobile-first layout, a popup that appears once every 14 days and a venue enquiry form. I built each of those directly.</w:t>
-      </w:r>
-    </w:p>
-    <w:p>
-      <w:r>
-        <w:t>One thing to be upfront about: I could not open the Figma prototype from my working environment because Figma blocks automated access. I therefore followed the page list and the Scope of Work for structure and content, and chose a green and gold palette with serif headings to suit a golf club. The layout will need a visual pass against the Figma frames before it is called pixel-accurate.</w:t>
+        <w:rPr>
+          <w:rFonts w:ascii="Consolas" w:hAnsi="Consolas"/>
+          <w:sz w:val="21"/>
+        </w:rPr>
+        <w:t>npm run dev</w:t>
       </w:r>
     </w:p>
     <w:p>
       <w:pPr>
-        <w:pStyle w:val="Heading1"/>
+        <w:spacing w:after="40"/>
       </w:pPr>
-      <w:r>
-        <w:t>3. What I built, page by page</w:t>
-      </w:r>
-    </w:p>
-    <w:p>
-      <w:pPr>
-        <w:pStyle w:val="Heading2"/>
-      </w:pPr>
-      <w:r>
-        <w:t>Home</w:t>
-      </w:r>
-    </w:p>
-    <w:p>
-      <w:pPr>
-        <w:pStyle w:val="ListBullet"/>
-      </w:pPr>
-      <w:r>
-        <w:t>Hero with "Book a Tee Time" (external booking link) and "Enquire About Events" (scrolls to the form).</w:t>
-      </w:r>
-    </w:p>
-    <w:p>
-      <w:pPr>
-        <w:pStyle w:val="ListBullet"/>
-      </w:pPr>
-      <w:r>
-        <w:t>Four feature tiles: Membership, Golf Outings, Dining, Weddings &amp; Events.</w:t>
-      </w:r>
-    </w:p>
-    <w:p>
-      <w:pPr>
-        <w:pStyle w:val="ListBullet"/>
-      </w:pPr>
-      <w:r>
-        <w:t>Two course cards linking to the course pages.</w:t>
-      </w:r>
-    </w:p>
-    <w:p>
-      <w:pPr>
-        <w:pStyle w:val="ListBullet"/>
-      </w:pPr>
-      <w:r>
-        <w:t>Upcoming events preview loaded from the API.</w:t>
-      </w:r>
-    </w:p>
-    <w:p>
-      <w:pPr>
-        <w:pStyle w:val="ListBullet"/>
-      </w:pPr>
-      <w:r>
-        <w:t>Photo gallery with a lightbox, a social feed section, the Stay &amp; Play banner and the E-Club signup.</w:t>
-      </w:r>
-    </w:p>
-    <w:p>
-      <w:pPr>
-        <w:pStyle w:val="ListBullet"/>
-      </w:pPr>
-      <w:r>
-        <w:t>The venue enquiry form at the bottom of the page.</w:t>
-      </w:r>
-    </w:p>
-    <w:p>
-      <w:pPr>
-        <w:pStyle w:val="Heading2"/>
-      </w:pPr>
-      <w:r>
-        <w:t>Lakes Course and Ranch Course</w:t>
-      </w:r>
     </w:p>
     <w:p>
       <w:r>
-        <w:t>Both use one shared CoursePage component driven by data, so each course has its own intro, stats (holes, par, yardage, slope), highlights, a hole-by-hole table, rates and a gallery. This kept the two pages consistent and meant I wrote the layout once.</w:t>
-      </w:r>
-    </w:p>
-    <w:p>
-      <w:pPr>
-        <w:pStyle w:val="Heading2"/>
-      </w:pPr>
-      <w:r>
-        <w:t>Golf Outings</w:t>
-      </w:r>
-    </w:p>
-    <w:p>
-      <w:r>
-        <w:t>Three outing packages, a four-step "how it works" section and the enquiry form pre-set to the Golf Outing event type.</w:t>
-      </w:r>
-    </w:p>
-    <w:p>
-      <w:pPr>
-        <w:pStyle w:val="Heading2"/>
-      </w:pPr>
-      <w:r>
-        <w:t>Membership</w:t>
-      </w:r>
-    </w:p>
-    <w:p>
-      <w:r>
-        <w:t>Three tiers (Weekday, Full Golf, Family) with the middle one highlighted, a short FAQ and an E-Club signup for visitors who are not ready to join.</w:t>
-      </w:r>
-    </w:p>
-    <w:p>
-      <w:pPr>
-        <w:pStyle w:val="Heading1"/>
-      </w:pPr>
-      <w:r>
-        <w:t>4. Features that took the most thought</w:t>
-      </w:r>
-    </w:p>
-    <w:p>
-      <w:pPr>
-        <w:pStyle w:val="ListBullet"/>
-      </w:pPr>
-      <w:r>
-        <w:t>Popup: it asks the API for the active campaign, shows only on the home page, and remembers dismissal in a cookie. The cookie name and the number of days come from the server, so the 14-day rule can be changed without redeploying the site. If the call fails, the page simply loads without the popup.</w:t>
-      </w:r>
-    </w:p>
-    <w:p>
-      <w:pPr>
-        <w:pStyle w:val="ListBullet"/>
-      </w:pPr>
-      <w:r>
-        <w:t>Enquiry form: validation mirrors the backend rules (required fields, phone format, one to three future dates, 1 to 500 guests), so people get instant feedback. If the server still rejects something, its field messages are shown next to the right field. On success the visitor sees their reference number.</w:t>
-      </w:r>
-    </w:p>
-    <w:p>
-      <w:pPr>
-        <w:pStyle w:val="ListBullet"/>
-      </w:pPr>
-      <w:r>
-        <w:t>Demo mode: if no API address is configured, the site uses sample events and simulates form submissions. This lets me develop and demonstrate the front end without running the back end.</w:t>
-      </w:r>
-    </w:p>
-    <w:p>
-      <w:pPr>
-        <w:pStyle w:val="ListBullet"/>
-      </w:pPr>
-      <w:r>
-        <w:t>Accessibility: skip link, labelled inputs, error messages announced to screen readers, keyboard control and focus handling in the popup and lightbox, and reduced-motion support.</w:t>
-      </w:r>
-    </w:p>
-    <w:p>
-      <w:pPr>
-        <w:pStyle w:val="ListBullet"/>
-      </w:pPr>
-      <w:r>
-        <w:t>Performance: the four secondary pages load on demand, so the first page load stays small.</w:t>
-      </w:r>
-    </w:p>
-    <w:p>
-      <w:pPr>
-        <w:pStyle w:val="Heading1"/>
-      </w:pPr>
-      <w:r>
-        <w:t>5. How I checked it</w:t>
-      </w:r>
-    </w:p>
-    <w:p>
-      <w:pPr>
-        <w:pStyle w:val="ListBullet"/>
-      </w:pPr>
-      <w:r>
-        <w:t>TypeScript type-check passes with strict settings.</w:t>
-      </w:r>
-    </w:p>
-    <w:p>
-      <w:pPr>
-        <w:pStyle w:val="ListBullet"/>
-      </w:pPr>
-      <w:r>
-        <w:t>17 automated tests pass: all five routes and the 404 page, popup show and cookie dismissal, enquiry validation and successful submit, E-Club signup, gallery lightbox, and the validation rules on their own.</w:t>
-      </w:r>
-    </w:p>
-    <w:p>
-      <w:pPr>
-        <w:pStyle w:val="ListBullet"/>
-      </w:pPr>
-      <w:r>
-        <w:t>The production build succeeds (main bundle about 63 KB gzipped).</w:t>
-      </w:r>
-    </w:p>
-    <w:p>
-      <w:pPr>
-        <w:pStyle w:val="ListBullet"/>
-      </w:pPr>
-      <w:r>
-        <w:t>I viewed the pages at desktop and phone widths in a real browser to check the layout.</w:t>
-      </w:r>
-    </w:p>
-    <w:p>
-      <w:pPr>
-        <w:pStyle w:val="Heading1"/>
-      </w:pPr>
-      <w:r>
-        <w:t>6. How it connects to my back end</w:t>
-      </w:r>
-    </w:p>
-    <w:p>
-      <w:r>
-        <w:t>The front end calls four endpoints of the Spring Boot service I built earlier: GET /api/v1/events/upcoming, GET /api/v1/popups/active, POST /api/v1/enquiries and POST /api/v1/eclub/subscribe. The request and response types in the code were copied from the back end DTOs, so the two sides agree. To run them together I set VITE_API_BASE_URL and add the front end origin to the back end CORS settings.</w:t>
-      </w:r>
-    </w:p>
-    <w:p>
-      <w:pPr>
-        <w:pStyle w:val="Heading1"/>
-      </w:pPr>
-      <w:r>
-        <w:t>6a. Images and video</w:t>
-      </w:r>
-    </w:p>
-    <w:p>
-      <w:r>
-        <w:t>The first version used flat placeholder artwork, which did not look convincing. I did not have access to licensed photography, so I rebuilt the visuals as layered landscape scenes: mountains, pine line, mown fairway, a pond with a reflection, drifting clouds, a swaying flag, birds and a slow camera push. I then rendered those animated scenes into five looping 12-second MP4 clips with ffmpeg.</w:t>
-      </w:r>
-    </w:p>
-    <w:p>
-      <w:pPr>
-        <w:pStyle w:val="ListBullet"/>
-      </w:pPr>
-      <w:r>
-        <w:t>The home page hero plays a muted looping background video, and each other page has its own clip.</w:t>
-      </w:r>
-    </w:p>
-    <w:p>
-      <w:pPr>
-        <w:pStyle w:val="ListBullet"/>
-      </w:pPr>
-      <w:r>
-        <w:t>A "Take a tour" section has four tap-to-play preview cards that open a video player.</w:t>
-      </w:r>
-    </w:p>
-    <w:p>
-      <w:pPr>
-        <w:pStyle w:val="ListBullet"/>
-      </w:pPr>
-      <w:r>
-        <w:t>Course pages have their own flyover previews.</w:t>
-      </w:r>
-    </w:p>
-    <w:p>
-      <w:pPr>
-        <w:pStyle w:val="ListBullet"/>
-      </w:pPr>
-      <w:r>
-        <w:t>All of it is controlled from one file (src/data/media.ts), so real photos and footage can replace the generated ones without touching the pages.</w:t>
-      </w:r>
-    </w:p>
-    <w:p>
-      <w:pPr>
-        <w:pStyle w:val="Heading1"/>
-      </w:pPr>
-      <w:r>
-        <w:t>7. What is still placeholder or left to do</w:t>
-      </w:r>
-    </w:p>
-    <w:p>
-      <w:pPr>
-        <w:pStyle w:val="ListBullet"/>
-      </w:pPr>
-      <w:r>
-        <w:t>Images and video are generated illustrations. Real course and event photography and footage need to replace them (drop files into public/media).</w:t>
-      </w:r>
-    </w:p>
-    <w:p>
-      <w:pPr>
-        <w:pStyle w:val="ListBullet"/>
-      </w:pPr>
-      <w:r>
-        <w:t>The booking link is a stand-in for the real ForeUP address.</w:t>
-      </w:r>
-    </w:p>
-    <w:p>
-      <w:pPr>
-        <w:pStyle w:val="ListBullet"/>
-      </w:pPr>
-      <w:r>
-        <w:t>Prices, hole details, address and phone number are sample content.</w:t>
-      </w:r>
-    </w:p>
-    <w:p>
-      <w:pPr>
-        <w:pStyle w:val="ListBullet"/>
-      </w:pPr>
-      <w:r>
-        <w:t>reCAPTCHA uses a development token; the real v3 widget must be added before launch.</w:t>
-      </w:r>
-    </w:p>
-    <w:p>
-      <w:pPr>
-        <w:pStyle w:val="ListBullet"/>
-      </w:pPr>
-      <w:r>
-        <w:t>A visual comparison against the Figma frames, and any spacing or colour changes that come out of it.</w:t>
-      </w:r>
-    </w:p>
-    <w:p>
-      <w:pPr>
-        <w:pStyle w:val="ListBullet"/>
-      </w:pPr>
-      <w:r>
-        <w:t>Dining, Weddings and the social feed currently point to the enquiry form or show static posts; they can become full pages later.</w:t>
-      </w:r>
-    </w:p>
-    <w:p>
-      <w:pPr>
-        <w:pStyle w:val="Heading1"/>
-      </w:pPr>
-      <w:r>
-        <w:t>8. How to run it</w:t>
-      </w:r>
-    </w:p>
-    <w:p>
-      <w:r>
-        <w:t>Install Node 20 or newer, then in the project folder run npm install followed by npm run dev and open http://localhost:5173. Use npm test to run the tests and npm run build for a production build. The README in the repository has the details.</w:t>
+        <w:t>Then open http://localhost:5173 in the browser. To connect it to my Spring Boot backend, I copy .env.example to .env.local and set the backend address there, which is http://localhost:8080 by default. Running npm test runs the tests, and npm run build creates the production version in the dist folder.</w:t>
       </w:r>
     </w:p>
     <w:sectPr>
@@ -742,6 +449,9 @@
     <w:name w:val="Normal"/>
     <w:qFormat/>
     <w:rsid w:val="00FC693F"/>
+    <w:pPr>
+      <w:spacing w:after="200" w:line="276" w:lineRule="auto"/>
+    </w:pPr>
     <w:rPr>
       <w:rFonts w:ascii="Calibri" w:hAnsi="Calibri"/>
       <w:sz w:val="22"/>
@@ -806,11 +516,11 @@
       <w:outlineLvl w:val="0"/>
     </w:pPr>
     <w:rPr>
-      <w:rFonts w:asciiTheme="majorHAnsi" w:eastAsiaTheme="majorEastAsia" w:hAnsiTheme="majorHAnsi" w:cstheme="majorBidi" w:ascii="Calibri" w:hAnsi="Calibri"/>
+      <w:rFonts w:asciiTheme="majorHAnsi" w:eastAsiaTheme="majorEastAsia" w:hAnsiTheme="majorHAnsi" w:cstheme="majorBidi"/>
       <w:b/>
       <w:bCs/>
-      <w:color w:val="14301F"/>
-      <w:sz w:val="32"/>
+      <w:color w:val="365F91" w:themeColor="accent1" w:themeShade="BF"/>
+      <w:sz w:val="28"/>
       <w:szCs w:val="28"/>
     </w:rPr>
   </w:style>
@@ -830,10 +540,10 @@
       <w:outlineLvl w:val="1"/>
     </w:pPr>
     <w:rPr>
-      <w:rFonts w:asciiTheme="majorHAnsi" w:eastAsiaTheme="majorEastAsia" w:hAnsiTheme="majorHAnsi" w:cstheme="majorBidi" w:ascii="Calibri" w:hAnsi="Calibri"/>
+      <w:rFonts w:asciiTheme="majorHAnsi" w:eastAsiaTheme="majorEastAsia" w:hAnsiTheme="majorHAnsi" w:cstheme="majorBidi"/>
       <w:b/>
       <w:bCs/>
-      <w:color w:val="14301F"/>
+      <w:color w:val="4F81BD" w:themeColor="accent1"/>
       <w:sz w:val="26"/>
       <w:szCs w:val="26"/>
     </w:rPr>

</xml_diff>

<commit_message>
feat: redesign to match the client sample page
Cream and deep-green design with Playfair Display headings, real course
photography, the Lakes Course page rebuilt section by section (stats,
gallery, seasonal hours, green fees, scorecard), shared hero, CTA,
E-Club band and footer, video previews generated from the photos, and
accessible dialogs. Bundled fonts, 25 tests.

Co-Authored-By: Claude Sonnet 5.5 <noreply@anthropic.com>
Claude-Session: https://claude.ai/code/session_013DtDBtLrDH5MyVK24hDNW2
</commit_message>
<xml_diff>
--- a/docs/WHAT_I_DID.docx
+++ b/docs/WHAT_I_DID.docx
@@ -12,12 +12,12 @@
     </w:p>
     <w:p>
       <w:r>
-        <w:t>I built the front end of the Genoa Golf Club website using React, Vite and TypeScript. The site has five pages: Home, Lakes Course, Ranch Course, Golf Outings and Membership. I worked from the page list and the Scope of Work, which describes what the homepage needs: a hero with a tee-time button and an events button, feature tiles, an events preview, a social feed, an E-Club signup, a Stay &amp; Play section, a popup that appears once every 14 days, and a venue enquiry form. Everything is built mobile-first, so it works on phones as well as desktops.</w:t>
+        <w:t>I built the front end of the Genoa Golf Club website using React, Vite and TypeScript. The site has five pages: Home, Lakes Course, Ranch Course, Golf Outings and Membership. I followed the Scope of Work and the sample page the client gave us, which is the Lakes Course page from their Figma prototype. The Scope of Work describes what the homepage needs: a hero with a tee-time button and an events button, feature tiles, an events preview, a social feed, an E-Club signup, a Stay &amp; Play section, a popup that appears once every 14 days, and a venue enquiry form. Everything is built mobile-first, so it works on phones as well as desktops.</w:t>
       </w:r>
     </w:p>
     <w:p>
       <w:r>
-        <w:t>I started with the shared parts: the header with a collapsing mobile menu, the footer, and the layout every page sits in. Then I built the Home page with all the sections above. For the two course pages I made one reusable template and filled it with each course's details, such as holes, par, yardage, highlights, a hole-by-hole table and rates, so the two pages stay consistent. The Golf Outings page has the outing packages, a short how-it-works section and the enquiry form already set to the golf outing type. The Membership page has three membership tiers, a short FAQ and the E-Club signup.</w:t>
+        <w:t>I took the look from the sample page: a cream and deep-green palette, serif headings, small gold section labels and green buttons, and I used the same photography. I started with the shared parts: the header with a collapsing mobile menu, the footer, the green Stay Connected signup band that sits above the footer, and the layout every page sits in. Then I built the Home page with all the sections above. I rebuilt the Lakes Course page section by section from the sample: the intro with the course description, the key numbers, the photo gallery, the seasonal hours of operation, the green fees table, the scorecard with the four tee boxes, and the booking call to action. I made it one reusable template, so the Ranch Course page uses exactly the same layout with its own details. The hours section also highlights whichever season is current. The Golf Outings page has the outing packages, a short how-it-works section and the enquiry form already set to the golf outing type. The Membership page has three membership tiers, a short FAQ and the E-Club signup.</w:t>
       </w:r>
     </w:p>
     <w:p>
@@ -27,12 +27,12 @@
     </w:p>
     <w:p>
       <w:r>
-        <w:t>To make the site feel real, I added a looping video in the hero of each page, a tour section with four preview cards that open a video player, flyover previews on the course pages, and a photo gallery with a full-screen viewer. Since I did not have real photography yet, I created animated landscape scenes and rendered them into short looping clips. All the images and videos are controlled from one file, so real photos and footage can replace them later without changing the pages. I also added keyboard support, labelled form fields and a reduced-motion option for accessibility, and the less-used pages load only when needed so the first load stays fast.</w:t>
+        <w:t>To make the site feel real, I added a looping video behind the home page hero, a tour section with four preview cards that open a video player, a flyover video on each course page, and a photo gallery with a full-screen viewer. I made the short clips from the sample page photos with a slow pan and zoom, using a small script so they can be rebuilt whenever a photo changes. All the images and videos are controlled from one file, so the club's original photos can replace them later without changing the pages. I also added keyboard support, labelled form fields and a reduced-motion option for accessibility, and the less-used pages load only when needed so the first load stays fast.</w:t>
       </w:r>
     </w:p>
     <w:p>
       <w:r>
-        <w:t>I tested it with 17 automated tests that cover every page, the popup and its cookie, the enquiry form with both errors and a successful submission, the E-Club signup, the gallery viewer and the video player. The type-check and production build both pass, and I checked the layout in a browser at desktop and phone sizes.</w:t>
+        <w:t>I tested it with 25 automated tests that cover every page, the seasonal hours logic, the scorecard, the popup and its cookie, the enquiry form with both errors and a successful submission, the E-Club signup, the mobile menu, the gallery viewer and the video player. The type-check and production build both pass, and I checked every page in a browser at phone, tablet and desktop widths for layout problems, missing images and console errors.</w:t>
       </w:r>
     </w:p>
     <w:p>

</xml_diff>